<commit_message>
Embed circular avatar and refine CV colors and fonts
</commit_message>
<xml_diff>
--- a/Sacha_Dubois_CV.docx
+++ b/Sacha_Dubois_CV.docx
@@ -24,7 +24,7 @@
         <w:tc>
           <w:tcPr>
             <w:tcW w:type="dxa" w:w="4104"/>
-            <w:shd w:val="clear" w:color="auto" w:fill="12325A"/>
+            <w:shd w:val="clear" w:color="auto" w:fill="143255"/>
             <w:tcMar>
               <w:top w:w="360" w:type="dxa"/>
               <w:start w:w="360" w:type="dxa"/>
@@ -34,22 +34,42 @@
           </w:tcPr>
           <w:p>
             <w:pPr>
-              <w:spacing w:before="0" w:after="120"/>
+              <w:spacing w:before="0" w:after="200"/>
               <w:jc w:val="center"/>
             </w:pPr>
             <w:r>
-              <w:rPr>
-                <w:rFonts w:ascii="Calibri" w:hAnsi="Calibri"/>
-                <w:b/>
-                <w:i w:val="0"/>
-                <w:color w:val="FFFFFF"/>
-                <w:sz w:val="22"/>
-              </w:rPr>
-              <w:br/>
-              <w:br/>
-              <w:t>[ PHOTO ]</w:t>
-              <w:br/>
-              <w:br/>
+              <w:drawing>
+                <wp:inline xmlns:a="http://schemas.openxmlformats.org/drawingml/2006/main" xmlns:pic="http://schemas.openxmlformats.org/drawingml/2006/picture">
+                  <wp:extent cx="1691640" cy="1691640"/>
+                  <wp:docPr id="1" name="Picture 1"/>
+                  <wp:cNvGraphicFramePr>
+                    <a:graphicFrameLocks noChangeAspect="1"/>
+                  </wp:cNvGraphicFramePr>
+                  <a:graphic>
+                    <a:graphicData uri="http://schemas.openxmlformats.org/drawingml/2006/picture">
+                      <pic:pic>
+                        <pic:nvPicPr>
+                          <pic:cNvPr id="0" name="avatar.png"/>
+                          <pic:cNvPicPr/>
+                        </pic:nvPicPr>
+                        <pic:blipFill>
+                          <a:blip r:embed="rId9"/>
+                          <a:stretch>
+                            <a:fillRect/>
+                          </a:stretch>
+                        </pic:blipFill>
+                        <pic:spPr>
+                          <a:xfrm>
+                            <a:off x="0" y="0"/>
+                            <a:ext cx="1691640" cy="1691640"/>
+                          </a:xfrm>
+                          <a:prstGeom prst="rect"/>
+                        </pic:spPr>
+                      </pic:pic>
+                    </a:graphicData>
+                  </a:graphic>
+                </wp:inline>
+              </w:drawing>
             </w:r>
           </w:p>
           <w:p>
@@ -58,7 +78,7 @@
             </w:pPr>
             <w:r>
               <w:rPr>
-                <w:rFonts w:ascii="Calibri" w:hAnsi="Calibri"/>
+                <w:rFonts w:ascii="Montserrat" w:hAnsi="Montserrat"/>
                 <w:b/>
                 <w:i w:val="0"/>
                 <w:color w:val="FFFFFF"/>
@@ -119,7 +139,7 @@
             </w:pPr>
             <w:r>
               <w:rPr>
-                <w:rFonts w:ascii="Calibri" w:hAnsi="Calibri"/>
+                <w:rFonts w:ascii="Montserrat" w:hAnsi="Montserrat"/>
                 <w:b/>
                 <w:i w:val="0"/>
                 <w:color w:val="FFFFFF"/>
@@ -187,7 +207,7 @@
               <w:tc>
                 <w:tcPr>
                   <w:tcW w:type="dxa" w:w="417"/>
-                  <w:shd w:val="clear" w:color="auto" w:fill="3A5A86"/>
+                  <w:shd w:val="clear" w:color="auto" w:fill="3C5C86"/>
                   <w:tcMar>
                     <w:top w:w="10" w:type="dxa"/>
                     <w:start w:w="0" w:type="dxa"/>
@@ -266,7 +286,7 @@
               <w:tc>
                 <w:tcPr>
                   <w:tcW w:type="dxa" w:w="1094"/>
-                  <w:shd w:val="clear" w:color="auto" w:fill="3A5A86"/>
+                  <w:shd w:val="clear" w:color="auto" w:fill="3C5C86"/>
                   <w:tcMar>
                     <w:top w:w="10" w:type="dxa"/>
                     <w:start w:w="0" w:type="dxa"/>
@@ -293,7 +313,7 @@
             </w:pPr>
             <w:r>
               <w:rPr>
-                <w:rFonts w:ascii="Calibri" w:hAnsi="Calibri"/>
+                <w:rFonts w:ascii="Montserrat" w:hAnsi="Montserrat"/>
                 <w:b/>
                 <w:i w:val="0"/>
                 <w:color w:val="FFFFFF"/>
@@ -399,7 +419,7 @@
             </w:pPr>
             <w:r>
               <w:rPr>
-                <w:rFonts w:ascii="Calibri" w:hAnsi="Calibri"/>
+                <w:rFonts w:ascii="Montserrat" w:hAnsi="Montserrat"/>
                 <w:b/>
                 <w:i w:val="0"/>
                 <w:color w:val="FFFFFF"/>
@@ -472,10 +492,10 @@
             </w:pPr>
             <w:r>
               <w:rPr>
-                <w:rFonts w:ascii="Calibri" w:hAnsi="Calibri"/>
+                <w:rFonts w:ascii="Montserrat" w:hAnsi="Montserrat"/>
                 <w:b/>
                 <w:i w:val="0"/>
-                <w:color w:val="12325A"/>
+                <w:color w:val="143255"/>
                 <w:sz w:val="68"/>
               </w:rPr>
               <w:t>SACHA DUBOIS</w:t>
@@ -487,10 +507,10 @@
             </w:pPr>
             <w:r>
               <w:rPr>
-                <w:rFonts w:ascii="Calibri" w:hAnsi="Calibri"/>
+                <w:rFonts w:ascii="Montserrat" w:hAnsi="Montserrat"/>
                 <w:b w:val="0"/>
                 <w:i w:val="0"/>
-                <w:color w:val="2E5E9E"/>
+                <w:color w:val="2F5C99"/>
                 <w:sz w:val="32"/>
                 <w:caps w:val="true"/>
               </w:rPr>
@@ -503,10 +523,10 @@
             </w:pPr>
             <w:r>
               <w:rPr>
-                <w:rFonts w:ascii="Calibri" w:hAnsi="Calibri"/>
+                <w:rFonts w:ascii="Montserrat" w:hAnsi="Montserrat"/>
                 <w:b/>
                 <w:i w:val="0"/>
-                <w:color w:val="12325A"/>
+                <w:color w:val="143255"/>
                 <w:sz w:val="36"/>
                 <w:caps w:val="true"/>
               </w:rPr>
@@ -522,10 +542,10 @@
             </w:pPr>
             <w:r>
               <w:rPr>
-                <w:rFonts w:ascii="Calibri" w:hAnsi="Calibri"/>
+                <w:rFonts w:ascii="Montserrat" w:hAnsi="Montserrat"/>
                 <w:b/>
                 <w:i w:val="0"/>
-                <w:color w:val="12325A"/>
+                <w:color w:val="143255"/>
                 <w:sz w:val="25"/>
               </w:rPr>
               <w:t>Master en Management</w:t>
@@ -535,7 +555,7 @@
                 <w:rFonts w:ascii="Calibri" w:hAnsi="Calibri"/>
                 <w:b w:val="0"/>
                 <w:i/>
-                <w:color w:val="2E5E9E"/>
+                <w:color w:val="2F5C99"/>
                 <w:sz w:val="20"/>
               </w:rPr>
               <w:tab/>
@@ -551,7 +571,7 @@
                 <w:rFonts w:ascii="Calibri" w:hAnsi="Calibri"/>
                 <w:b w:val="0"/>
                 <w:i w:val="0"/>
-                <w:color w:val="2E5E9E"/>
+                <w:color w:val="2F5C99"/>
                 <w:sz w:val="23"/>
               </w:rPr>
               <w:t>Really Great School - Any City</w:t>
@@ -566,10 +586,10 @@
             </w:pPr>
             <w:r>
               <w:rPr>
-                <w:rFonts w:ascii="Calibri" w:hAnsi="Calibri"/>
+                <w:rFonts w:ascii="Montserrat" w:hAnsi="Montserrat"/>
                 <w:b/>
                 <w:i w:val="0"/>
-                <w:color w:val="12325A"/>
+                <w:color w:val="143255"/>
                 <w:sz w:val="25"/>
               </w:rPr>
               <w:t>Licence en Gestion Administrative</w:t>
@@ -579,7 +599,7 @@
                 <w:rFonts w:ascii="Calibri" w:hAnsi="Calibri"/>
                 <w:b w:val="0"/>
                 <w:i/>
-                <w:color w:val="2E5E9E"/>
+                <w:color w:val="2F5C99"/>
                 <w:sz w:val="20"/>
               </w:rPr>
               <w:tab/>
@@ -595,7 +615,7 @@
                 <w:rFonts w:ascii="Calibri" w:hAnsi="Calibri"/>
                 <w:b w:val="0"/>
                 <w:i w:val="0"/>
-                <w:color w:val="2E5E9E"/>
+                <w:color w:val="2F5C99"/>
                 <w:sz w:val="23"/>
               </w:rPr>
               <w:t>Really Great School - Any City</w:t>
@@ -607,10 +627,10 @@
             </w:pPr>
             <w:r>
               <w:rPr>
-                <w:rFonts w:ascii="Calibri" w:hAnsi="Calibri"/>
+                <w:rFonts w:ascii="Montserrat" w:hAnsi="Montserrat"/>
                 <w:b/>
                 <w:i w:val="0"/>
-                <w:color w:val="12325A"/>
+                <w:color w:val="143255"/>
                 <w:sz w:val="36"/>
                 <w:caps w:val="true"/>
               </w:rPr>
@@ -626,10 +646,10 @@
             </w:pPr>
             <w:r>
               <w:rPr>
-                <w:rFonts w:ascii="Calibri" w:hAnsi="Calibri"/>
+                <w:rFonts w:ascii="Montserrat" w:hAnsi="Montserrat"/>
                 <w:b/>
                 <w:i w:val="0"/>
-                <w:color w:val="12325A"/>
+                <w:color w:val="143255"/>
                 <w:sz w:val="25"/>
               </w:rPr>
               <w:t>Chargée de Projet</w:t>
@@ -639,7 +659,7 @@
                 <w:rFonts w:ascii="Calibri" w:hAnsi="Calibri"/>
                 <w:b w:val="0"/>
                 <w:i/>
-                <w:color w:val="2E5E9E"/>
+                <w:color w:val="2F5C99"/>
                 <w:sz w:val="20"/>
               </w:rPr>
               <w:tab/>
@@ -655,7 +675,7 @@
                 <w:rFonts w:ascii="Calibri" w:hAnsi="Calibri"/>
                 <w:b w:val="0"/>
                 <w:i/>
-                <w:color w:val="2E5E9E"/>
+                <w:color w:val="2F5C99"/>
                 <w:sz w:val="23"/>
               </w:rPr>
               <w:t>Really Great Company - Any City</w:t>
@@ -671,7 +691,7 @@
                 <w:rFonts w:ascii="Calibri" w:hAnsi="Calibri"/>
                 <w:b w:val="0"/>
                 <w:i w:val="0"/>
-                <w:color w:val="2E5E9E"/>
+                <w:color w:val="2F5C99"/>
                 <w:sz w:val="22"/>
               </w:rPr>
               <w:t xml:space="preserve">•  </w:t>
@@ -681,7 +701,7 @@
                 <w:rFonts w:ascii="Calibri" w:hAnsi="Calibri"/>
                 <w:b w:val="0"/>
                 <w:i w:val="0"/>
-                <w:color w:val="2E5E9E"/>
+                <w:color w:val="2F5C99"/>
                 <w:sz w:val="22"/>
               </w:rPr>
               <w:t>Elaboration du plan de projet et gestion des calendriers</w:t>
@@ -697,7 +717,7 @@
                 <w:rFonts w:ascii="Calibri" w:hAnsi="Calibri"/>
                 <w:b w:val="0"/>
                 <w:i w:val="0"/>
-                <w:color w:val="2E5E9E"/>
+                <w:color w:val="2F5C99"/>
                 <w:sz w:val="22"/>
               </w:rPr>
               <w:t xml:space="preserve">•  </w:t>
@@ -707,7 +727,7 @@
                 <w:rFonts w:ascii="Calibri" w:hAnsi="Calibri"/>
                 <w:b w:val="0"/>
                 <w:i w:val="0"/>
-                <w:color w:val="2E5E9E"/>
+                <w:color w:val="2F5C99"/>
                 <w:sz w:val="22"/>
               </w:rPr>
               <w:t>Gestion des ressources et du budget</w:t>
@@ -723,7 +743,7 @@
                 <w:rFonts w:ascii="Calibri" w:hAnsi="Calibri"/>
                 <w:b w:val="0"/>
                 <w:i w:val="0"/>
-                <w:color w:val="2E5E9E"/>
+                <w:color w:val="2F5C99"/>
                 <w:sz w:val="22"/>
               </w:rPr>
               <w:t xml:space="preserve">•  </w:t>
@@ -733,7 +753,7 @@
                 <w:rFonts w:ascii="Calibri" w:hAnsi="Calibri"/>
                 <w:b w:val="0"/>
                 <w:i w:val="0"/>
-                <w:color w:val="2E5E9E"/>
+                <w:color w:val="2F5C99"/>
                 <w:sz w:val="22"/>
               </w:rPr>
               <w:t>Gestion des risques (identification des risques, réaction aux imprévus)</w:t>
@@ -748,10 +768,10 @@
             </w:pPr>
             <w:r>
               <w:rPr>
-                <w:rFonts w:ascii="Calibri" w:hAnsi="Calibri"/>
+                <w:rFonts w:ascii="Montserrat" w:hAnsi="Montserrat"/>
                 <w:b/>
                 <w:i w:val="0"/>
-                <w:color w:val="12325A"/>
+                <w:color w:val="143255"/>
                 <w:sz w:val="25"/>
               </w:rPr>
               <w:t>Assistante Chargée de Projet</w:t>
@@ -761,7 +781,7 @@
                 <w:rFonts w:ascii="Calibri" w:hAnsi="Calibri"/>
                 <w:b w:val="0"/>
                 <w:i/>
-                <w:color w:val="2E5E9E"/>
+                <w:color w:val="2F5C99"/>
                 <w:sz w:val="20"/>
               </w:rPr>
               <w:tab/>
@@ -777,7 +797,7 @@
                 <w:rFonts w:ascii="Calibri" w:hAnsi="Calibri"/>
                 <w:b w:val="0"/>
                 <w:i/>
-                <w:color w:val="2E5E9E"/>
+                <w:color w:val="2F5C99"/>
                 <w:sz w:val="23"/>
               </w:rPr>
               <w:t>Really Great Company - Any City</w:t>
@@ -793,7 +813,7 @@
                 <w:rFonts w:ascii="Calibri" w:hAnsi="Calibri"/>
                 <w:b w:val="0"/>
                 <w:i w:val="0"/>
-                <w:color w:val="2E5E9E"/>
+                <w:color w:val="2F5C99"/>
                 <w:sz w:val="22"/>
               </w:rPr>
               <w:t xml:space="preserve">•  </w:t>
@@ -803,7 +823,7 @@
                 <w:rFonts w:ascii="Calibri" w:hAnsi="Calibri"/>
                 <w:b w:val="0"/>
                 <w:i w:val="0"/>
-                <w:color w:val="2E5E9E"/>
+                <w:color w:val="2F5C99"/>
                 <w:sz w:val="22"/>
               </w:rPr>
               <w:t>Rédaction des rapports de progression</w:t>
@@ -819,7 +839,7 @@
                 <w:rFonts w:ascii="Calibri" w:hAnsi="Calibri"/>
                 <w:b w:val="0"/>
                 <w:i w:val="0"/>
-                <w:color w:val="2E5E9E"/>
+                <w:color w:val="2F5C99"/>
                 <w:sz w:val="22"/>
               </w:rPr>
               <w:t xml:space="preserve">•  </w:t>
@@ -829,7 +849,7 @@
                 <w:rFonts w:ascii="Calibri" w:hAnsi="Calibri"/>
                 <w:b w:val="0"/>
                 <w:i w:val="0"/>
-                <w:color w:val="2E5E9E"/>
+                <w:color w:val="2F5C99"/>
                 <w:sz w:val="22"/>
               </w:rPr>
               <w:t>Participation aux réunions de suivi de projet</w:t>
@@ -845,7 +865,7 @@
                 <w:rFonts w:ascii="Calibri" w:hAnsi="Calibri"/>
                 <w:b w:val="0"/>
                 <w:i w:val="0"/>
-                <w:color w:val="2E5E9E"/>
+                <w:color w:val="2F5C99"/>
                 <w:sz w:val="22"/>
               </w:rPr>
               <w:t xml:space="preserve">•  </w:t>
@@ -855,7 +875,7 @@
                 <w:rFonts w:ascii="Calibri" w:hAnsi="Calibri"/>
                 <w:b w:val="0"/>
                 <w:i w:val="0"/>
-                <w:color w:val="2E5E9E"/>
+                <w:color w:val="2F5C99"/>
                 <w:sz w:val="22"/>
               </w:rPr>
               <w:t>Suivi de l'avancement des projets en collaboration avec les équipes concernées</w:t>
@@ -870,10 +890,10 @@
             </w:pPr>
             <w:r>
               <w:rPr>
-                <w:rFonts w:ascii="Calibri" w:hAnsi="Calibri"/>
+                <w:rFonts w:ascii="Montserrat" w:hAnsi="Montserrat"/>
                 <w:b/>
                 <w:i w:val="0"/>
-                <w:color w:val="12325A"/>
+                <w:color w:val="143255"/>
                 <w:sz w:val="25"/>
               </w:rPr>
               <w:t>Stagiaire Chargée de Projet</w:t>
@@ -883,7 +903,7 @@
                 <w:rFonts w:ascii="Calibri" w:hAnsi="Calibri"/>
                 <w:b w:val="0"/>
                 <w:i/>
-                <w:color w:val="2E5E9E"/>
+                <w:color w:val="2F5C99"/>
                 <w:sz w:val="20"/>
               </w:rPr>
               <w:tab/>
@@ -899,7 +919,7 @@
                 <w:rFonts w:ascii="Calibri" w:hAnsi="Calibri"/>
                 <w:b w:val="0"/>
                 <w:i/>
-                <w:color w:val="2E5E9E"/>
+                <w:color w:val="2F5C99"/>
                 <w:sz w:val="23"/>
               </w:rPr>
               <w:t>Really Great Company - Any City</w:t>
@@ -915,7 +935,7 @@
                 <w:rFonts w:ascii="Calibri" w:hAnsi="Calibri"/>
                 <w:b w:val="0"/>
                 <w:i w:val="0"/>
-                <w:color w:val="2E5E9E"/>
+                <w:color w:val="2F5C99"/>
                 <w:sz w:val="22"/>
               </w:rPr>
               <w:t xml:space="preserve">•  </w:t>
@@ -925,7 +945,7 @@
                 <w:rFonts w:ascii="Calibri" w:hAnsi="Calibri"/>
                 <w:b w:val="0"/>
                 <w:i w:val="0"/>
-                <w:color w:val="2E5E9E"/>
+                <w:color w:val="2F5C99"/>
                 <w:sz w:val="22"/>
               </w:rPr>
               <w:t>Aide pour définir les objectifs et les périmètres du projet</w:t>
@@ -941,7 +961,7 @@
                 <w:rFonts w:ascii="Calibri" w:hAnsi="Calibri"/>
                 <w:b w:val="0"/>
                 <w:i w:val="0"/>
-                <w:color w:val="2E5E9E"/>
+                <w:color w:val="2F5C99"/>
                 <w:sz w:val="22"/>
               </w:rPr>
               <w:t xml:space="preserve">•  </w:t>
@@ -951,7 +971,7 @@
                 <w:rFonts w:ascii="Calibri" w:hAnsi="Calibri"/>
                 <w:b w:val="0"/>
                 <w:i w:val="0"/>
-                <w:color w:val="2E5E9E"/>
+                <w:color w:val="2F5C99"/>
                 <w:sz w:val="22"/>
               </w:rPr>
               <w:t>Participation à l'élaboration des plans de projet (échéanciers, jalons et livrables)</w:t>

</xml_diff>

<commit_message>
Expand CV to 3 pages: profile, projects, certifications, references
</commit_message>
<xml_diff>
--- a/Sacha_Dubois_CV.docx
+++ b/Sacha_Dubois_CV.docx
@@ -980,6 +980,1083 @@
         </w:tc>
       </w:tr>
     </w:tbl>
+    <w:p>
+      <w:r>
+        <w:br w:type="page"/>
+      </w:r>
+    </w:p>
+    <w:tbl>
+      <w:tblPr>
+        <w:tblW w:type="auto" w:w="0"/>
+        <w:tblLook w:firstColumn="1" w:firstRow="1" w:lastColumn="0" w:lastRow="0" w:noHBand="0" w:noVBand="1" w:val="04A0"/>
+        <w:tblBorders>
+          <w:top w:val="none" w:sz="0" w:space="0"/>
+          <w:left w:val="none" w:sz="0" w:space="0"/>
+          <w:bottom w:val="none" w:sz="0" w:space="0"/>
+          <w:right w:val="none" w:sz="0" w:space="0"/>
+          <w:insideH w:val="none" w:sz="0" w:space="0"/>
+          <w:insideV w:val="none" w:sz="0" w:space="0"/>
+        </w:tblBorders>
+      </w:tblPr>
+      <w:tblGrid>
+        <w:gridCol w:w="9029"/>
+      </w:tblGrid>
+      <w:tr>
+        <w:tc>
+          <w:tcPr>
+            <w:tcW w:type="dxa" w:w="11908"/>
+            <w:shd w:val="clear" w:color="auto" w:fill="143255"/>
+            <w:tcMar>
+              <w:top w:w="170" w:type="dxa"/>
+              <w:start w:w="1007" w:type="dxa"/>
+              <w:bottom w:w="170" w:type="dxa"/>
+              <w:end w:w="500" w:type="dxa"/>
+            </w:tcMar>
+          </w:tcPr>
+          <w:p>
+            <w:pPr>
+              <w:spacing w:before="0" w:after="0"/>
+            </w:pPr>
+            <w:r>
+              <w:rPr>
+                <w:rFonts w:ascii="Montserrat" w:hAnsi="Montserrat"/>
+                <w:b/>
+                <w:i w:val="0"/>
+                <w:color w:val="FFFFFF"/>
+                <w:sz w:val="36"/>
+              </w:rPr>
+              <w:t>SACHA DUBOIS</w:t>
+            </w:r>
+          </w:p>
+          <w:p>
+            <w:pPr>
+              <w:spacing w:before="0" w:after="0"/>
+            </w:pPr>
+            <w:r>
+              <w:rPr>
+                <w:rFonts w:ascii="Montserrat" w:hAnsi="Montserrat"/>
+                <w:b w:val="0"/>
+                <w:i w:val="0"/>
+                <w:color w:val="FFFFFF"/>
+                <w:sz w:val="21"/>
+                <w:caps w:val="true"/>
+              </w:rPr>
+              <w:t>CHARGÉE DE PROJET</w:t>
+            </w:r>
+          </w:p>
+        </w:tc>
+      </w:tr>
+    </w:tbl>
+    <w:p>
+      <w:pPr>
+        <w:spacing w:before="0" w:after="120"/>
+      </w:pPr>
+    </w:p>
+    <w:p>
+      <w:pPr>
+        <w:spacing w:before="240" w:after="160"/>
+        <w:ind w:left="1008" w:right="1008"/>
+      </w:pPr>
+      <w:r>
+        <w:rPr>
+          <w:rFonts w:ascii="Montserrat" w:hAnsi="Montserrat"/>
+          <w:b/>
+          <w:i w:val="0"/>
+          <w:color w:val="143255"/>
+          <w:sz w:val="32"/>
+          <w:caps w:val="true"/>
+        </w:rPr>
+        <w:t>Profil Professionnel</w:t>
+      </w:r>
+    </w:p>
+    <w:p>
+      <w:pPr>
+        <w:spacing w:before="0" w:after="120" w:line="276" w:lineRule="auto"/>
+        <w:ind w:left="1008" w:right="1008"/>
+      </w:pPr>
+      <w:r>
+        <w:rPr>
+          <w:rFonts w:ascii="Calibri" w:hAnsi="Calibri"/>
+          <w:b w:val="0"/>
+          <w:i w:val="0"/>
+          <w:color w:val="143255"/>
+          <w:sz w:val="22"/>
+        </w:rPr>
+        <w:t>Chargée de projet rigoureuse et orientée résultats, forte de plusieurs années d'expérience dans la planification, la coordination et le pilotage de projets pluridisciplinaires. Reconnue pour ma capacité à fédérer les équipes, à gérer les budgets et les délais, et à transformer des objectifs stratégiques en livrables concrets. À la recherche de nouveaux défis permettant de mettre à profit mon expertise en gestion de projet et en amélioration continue.</w:t>
+      </w:r>
+    </w:p>
+    <w:p>
+      <w:pPr>
+        <w:spacing w:before="240" w:after="160"/>
+        <w:ind w:left="1008" w:right="1008"/>
+      </w:pPr>
+      <w:r>
+        <w:rPr>
+          <w:rFonts w:ascii="Montserrat" w:hAnsi="Montserrat"/>
+          <w:b/>
+          <w:i w:val="0"/>
+          <w:color w:val="143255"/>
+          <w:sz w:val="32"/>
+          <w:caps w:val="true"/>
+        </w:rPr>
+        <w:t>Domaines d'Expertise</w:t>
+      </w:r>
+    </w:p>
+    <w:p>
+      <w:pPr>
+        <w:spacing w:before="0" w:after="40" w:line="240" w:lineRule="auto"/>
+        <w:ind w:left="1411" w:right="1008" w:hanging="259"/>
+      </w:pPr>
+      <w:r>
+        <w:rPr>
+          <w:rFonts w:ascii="Calibri" w:hAnsi="Calibri"/>
+          <w:b w:val="0"/>
+          <w:i w:val="0"/>
+          <w:color w:val="2F5C99"/>
+          <w:sz w:val="22"/>
+        </w:rPr>
+        <w:t xml:space="preserve">•  </w:t>
+      </w:r>
+      <w:r>
+        <w:rPr>
+          <w:rFonts w:ascii="Calibri" w:hAnsi="Calibri"/>
+          <w:b w:val="0"/>
+          <w:i w:val="0"/>
+          <w:color w:val="2F5C99"/>
+          <w:sz w:val="22"/>
+        </w:rPr>
+        <w:t>Planification stratégique et gestion de portefeuille de projets</w:t>
+      </w:r>
+    </w:p>
+    <w:p>
+      <w:pPr>
+        <w:spacing w:before="0" w:after="40" w:line="240" w:lineRule="auto"/>
+        <w:ind w:left="1411" w:right="1008" w:hanging="259"/>
+      </w:pPr>
+      <w:r>
+        <w:rPr>
+          <w:rFonts w:ascii="Calibri" w:hAnsi="Calibri"/>
+          <w:b w:val="0"/>
+          <w:i w:val="0"/>
+          <w:color w:val="2F5C99"/>
+          <w:sz w:val="22"/>
+        </w:rPr>
+        <w:t xml:space="preserve">•  </w:t>
+      </w:r>
+      <w:r>
+        <w:rPr>
+          <w:rFonts w:ascii="Calibri" w:hAnsi="Calibri"/>
+          <w:b w:val="0"/>
+          <w:i w:val="0"/>
+          <w:color w:val="2F5C99"/>
+          <w:sz w:val="22"/>
+        </w:rPr>
+        <w:t>Pilotage budgétaire, suivi des coûts et reporting financier</w:t>
+      </w:r>
+    </w:p>
+    <w:p>
+      <w:pPr>
+        <w:spacing w:before="0" w:after="40" w:line="240" w:lineRule="auto"/>
+        <w:ind w:left="1411" w:right="1008" w:hanging="259"/>
+      </w:pPr>
+      <w:r>
+        <w:rPr>
+          <w:rFonts w:ascii="Calibri" w:hAnsi="Calibri"/>
+          <w:b w:val="0"/>
+          <w:i w:val="0"/>
+          <w:color w:val="2F5C99"/>
+          <w:sz w:val="22"/>
+        </w:rPr>
+        <w:t xml:space="preserve">•  </w:t>
+      </w:r>
+      <w:r>
+        <w:rPr>
+          <w:rFonts w:ascii="Calibri" w:hAnsi="Calibri"/>
+          <w:b w:val="0"/>
+          <w:i w:val="0"/>
+          <w:color w:val="2F5C99"/>
+          <w:sz w:val="22"/>
+        </w:rPr>
+        <w:t>Gestion des risques, des parties prenantes et de la qualité</w:t>
+      </w:r>
+    </w:p>
+    <w:p>
+      <w:pPr>
+        <w:spacing w:before="0" w:after="40" w:line="240" w:lineRule="auto"/>
+        <w:ind w:left="1411" w:right="1008" w:hanging="259"/>
+      </w:pPr>
+      <w:r>
+        <w:rPr>
+          <w:rFonts w:ascii="Calibri" w:hAnsi="Calibri"/>
+          <w:b w:val="0"/>
+          <w:i w:val="0"/>
+          <w:color w:val="2F5C99"/>
+          <w:sz w:val="22"/>
+        </w:rPr>
+        <w:t xml:space="preserve">•  </w:t>
+      </w:r>
+      <w:r>
+        <w:rPr>
+          <w:rFonts w:ascii="Calibri" w:hAnsi="Calibri"/>
+          <w:b w:val="0"/>
+          <w:i w:val="0"/>
+          <w:color w:val="2F5C99"/>
+          <w:sz w:val="22"/>
+        </w:rPr>
+        <w:t>Méthodologies Agile (Scrum, Kanban) et cycle en V</w:t>
+      </w:r>
+    </w:p>
+    <w:p>
+      <w:pPr>
+        <w:spacing w:before="0" w:after="40" w:line="240" w:lineRule="auto"/>
+        <w:ind w:left="1411" w:right="1008" w:hanging="259"/>
+      </w:pPr>
+      <w:r>
+        <w:rPr>
+          <w:rFonts w:ascii="Calibri" w:hAnsi="Calibri"/>
+          <w:b w:val="0"/>
+          <w:i w:val="0"/>
+          <w:color w:val="2F5C99"/>
+          <w:sz w:val="22"/>
+        </w:rPr>
+        <w:t xml:space="preserve">•  </w:t>
+      </w:r>
+      <w:r>
+        <w:rPr>
+          <w:rFonts w:ascii="Calibri" w:hAnsi="Calibri"/>
+          <w:b w:val="0"/>
+          <w:i w:val="0"/>
+          <w:color w:val="2F5C99"/>
+          <w:sz w:val="22"/>
+        </w:rPr>
+        <w:t>Animation d'équipes et conduite du changement</w:t>
+      </w:r>
+    </w:p>
+    <w:p>
+      <w:pPr>
+        <w:spacing w:before="240" w:after="160"/>
+        <w:ind w:left="1008" w:right="1008"/>
+      </w:pPr>
+      <w:r>
+        <w:rPr>
+          <w:rFonts w:ascii="Montserrat" w:hAnsi="Montserrat"/>
+          <w:b/>
+          <w:i w:val="0"/>
+          <w:color w:val="143255"/>
+          <w:sz w:val="32"/>
+          <w:caps w:val="true"/>
+        </w:rPr>
+        <w:t>Projets Marquants</w:t>
+      </w:r>
+    </w:p>
+    <w:p>
+      <w:pPr>
+        <w:tabs>
+          <w:tab w:pos="10800" w:val="right"/>
+        </w:tabs>
+        <w:spacing w:before="160" w:after="0" w:line="240" w:lineRule="auto"/>
+        <w:ind w:left="1008" w:right="1008"/>
+      </w:pPr>
+      <w:r>
+        <w:rPr>
+          <w:rFonts w:ascii="Montserrat" w:hAnsi="Montserrat"/>
+          <w:b/>
+          <w:i w:val="0"/>
+          <w:color w:val="143255"/>
+          <w:sz w:val="25"/>
+        </w:rPr>
+        <w:t>Déploiement d'un outil de gestion collaboratif</w:t>
+      </w:r>
+      <w:r>
+        <w:rPr>
+          <w:rFonts w:ascii="Calibri" w:hAnsi="Calibri"/>
+          <w:b w:val="0"/>
+          <w:i/>
+          <w:color w:val="2F5C99"/>
+          <w:sz w:val="20"/>
+        </w:rPr>
+        <w:tab/>
+        <w:t>2022 - 2023</w:t>
+      </w:r>
+    </w:p>
+    <w:p>
+      <w:pPr>
+        <w:spacing w:before="0" w:after="40" w:line="240" w:lineRule="auto"/>
+        <w:ind w:left="1008"/>
+      </w:pPr>
+      <w:r>
+        <w:rPr>
+          <w:rFonts w:ascii="Calibri" w:hAnsi="Calibri"/>
+          <w:b w:val="0"/>
+          <w:i/>
+          <w:color w:val="2F5C99"/>
+          <w:sz w:val="23"/>
+        </w:rPr>
+        <w:t>Really Great Company - Any City</w:t>
+      </w:r>
+    </w:p>
+    <w:p>
+      <w:pPr>
+        <w:spacing w:before="0" w:after="40" w:line="240" w:lineRule="auto"/>
+        <w:ind w:left="1411" w:right="1008" w:hanging="259"/>
+      </w:pPr>
+      <w:r>
+        <w:rPr>
+          <w:rFonts w:ascii="Calibri" w:hAnsi="Calibri"/>
+          <w:b w:val="0"/>
+          <w:i w:val="0"/>
+          <w:color w:val="2F5C99"/>
+          <w:sz w:val="22"/>
+        </w:rPr>
+        <w:t xml:space="preserve">•  </w:t>
+      </w:r>
+      <w:r>
+        <w:rPr>
+          <w:rFonts w:ascii="Calibri" w:hAnsi="Calibri"/>
+          <w:b w:val="0"/>
+          <w:i w:val="0"/>
+          <w:color w:val="2F5C99"/>
+          <w:sz w:val="22"/>
+        </w:rPr>
+        <w:t>Pilotage d'un projet de 12 mois mobilisant une équipe de 15 personnes.</w:t>
+      </w:r>
+    </w:p>
+    <w:p>
+      <w:pPr>
+        <w:spacing w:before="0" w:after="40" w:line="240" w:lineRule="auto"/>
+        <w:ind w:left="1411" w:right="1008" w:hanging="259"/>
+      </w:pPr>
+      <w:r>
+        <w:rPr>
+          <w:rFonts w:ascii="Calibri" w:hAnsi="Calibri"/>
+          <w:b w:val="0"/>
+          <w:i w:val="0"/>
+          <w:color w:val="2F5C99"/>
+          <w:sz w:val="22"/>
+        </w:rPr>
+        <w:t xml:space="preserve">•  </w:t>
+      </w:r>
+      <w:r>
+        <w:rPr>
+          <w:rFonts w:ascii="Calibri" w:hAnsi="Calibri"/>
+          <w:b w:val="0"/>
+          <w:i w:val="0"/>
+          <w:color w:val="2F5C99"/>
+          <w:sz w:val="22"/>
+        </w:rPr>
+        <w:t>Réduction de 25 % des délais de traitement des demandes internes.</w:t>
+      </w:r>
+    </w:p>
+    <w:p>
+      <w:pPr>
+        <w:spacing w:before="0" w:after="40" w:line="240" w:lineRule="auto"/>
+        <w:ind w:left="1411" w:right="1008" w:hanging="259"/>
+      </w:pPr>
+      <w:r>
+        <w:rPr>
+          <w:rFonts w:ascii="Calibri" w:hAnsi="Calibri"/>
+          <w:b w:val="0"/>
+          <w:i w:val="0"/>
+          <w:color w:val="2F5C99"/>
+          <w:sz w:val="22"/>
+        </w:rPr>
+        <w:t xml:space="preserve">•  </w:t>
+      </w:r>
+      <w:r>
+        <w:rPr>
+          <w:rFonts w:ascii="Calibri" w:hAnsi="Calibri"/>
+          <w:b w:val="0"/>
+          <w:i w:val="0"/>
+          <w:color w:val="2F5C99"/>
+          <w:sz w:val="22"/>
+        </w:rPr>
+        <w:t>Respect du budget initial et livraison conforme au cahier des charges.</w:t>
+      </w:r>
+    </w:p>
+    <w:p>
+      <w:pPr>
+        <w:tabs>
+          <w:tab w:pos="10800" w:val="right"/>
+        </w:tabs>
+        <w:spacing w:before="160" w:after="0" w:line="240" w:lineRule="auto"/>
+        <w:ind w:left="1008" w:right="1008"/>
+      </w:pPr>
+      <w:r>
+        <w:rPr>
+          <w:rFonts w:ascii="Montserrat" w:hAnsi="Montserrat"/>
+          <w:b/>
+          <w:i w:val="0"/>
+          <w:color w:val="143255"/>
+          <w:sz w:val="25"/>
+        </w:rPr>
+        <w:t>Réorganisation des processus internes</w:t>
+      </w:r>
+      <w:r>
+        <w:rPr>
+          <w:rFonts w:ascii="Calibri" w:hAnsi="Calibri"/>
+          <w:b w:val="0"/>
+          <w:i/>
+          <w:color w:val="2F5C99"/>
+          <w:sz w:val="20"/>
+        </w:rPr>
+        <w:tab/>
+        <w:t>2021</w:t>
+      </w:r>
+    </w:p>
+    <w:p>
+      <w:pPr>
+        <w:spacing w:before="0" w:after="40" w:line="240" w:lineRule="auto"/>
+        <w:ind w:left="1008"/>
+      </w:pPr>
+      <w:r>
+        <w:rPr>
+          <w:rFonts w:ascii="Calibri" w:hAnsi="Calibri"/>
+          <w:b w:val="0"/>
+          <w:i/>
+          <w:color w:val="2F5C99"/>
+          <w:sz w:val="23"/>
+        </w:rPr>
+        <w:t>Really Great Company - Any City</w:t>
+      </w:r>
+    </w:p>
+    <w:p>
+      <w:pPr>
+        <w:spacing w:before="0" w:after="40" w:line="240" w:lineRule="auto"/>
+        <w:ind w:left="1411" w:right="1008" w:hanging="259"/>
+      </w:pPr>
+      <w:r>
+        <w:rPr>
+          <w:rFonts w:ascii="Calibri" w:hAnsi="Calibri"/>
+          <w:b w:val="0"/>
+          <w:i w:val="0"/>
+          <w:color w:val="2F5C99"/>
+          <w:sz w:val="22"/>
+        </w:rPr>
+        <w:t xml:space="preserve">•  </w:t>
+      </w:r>
+      <w:r>
+        <w:rPr>
+          <w:rFonts w:ascii="Calibri" w:hAnsi="Calibri"/>
+          <w:b w:val="0"/>
+          <w:i w:val="0"/>
+          <w:color w:val="2F5C99"/>
+          <w:sz w:val="22"/>
+        </w:rPr>
+        <w:t>Cartographie et optimisation de 8 processus métier clés.</w:t>
+      </w:r>
+    </w:p>
+    <w:p>
+      <w:pPr>
+        <w:spacing w:before="0" w:after="40" w:line="240" w:lineRule="auto"/>
+        <w:ind w:left="1411" w:right="1008" w:hanging="259"/>
+      </w:pPr>
+      <w:r>
+        <w:rPr>
+          <w:rFonts w:ascii="Calibri" w:hAnsi="Calibri"/>
+          <w:b w:val="0"/>
+          <w:i w:val="0"/>
+          <w:color w:val="2F5C99"/>
+          <w:sz w:val="22"/>
+        </w:rPr>
+        <w:t xml:space="preserve">•  </w:t>
+      </w:r>
+      <w:r>
+        <w:rPr>
+          <w:rFonts w:ascii="Calibri" w:hAnsi="Calibri"/>
+          <w:b w:val="0"/>
+          <w:i w:val="0"/>
+          <w:color w:val="2F5C99"/>
+          <w:sz w:val="22"/>
+        </w:rPr>
+        <w:t>Mise en place d'indicateurs de performance et de tableaux de bord.</w:t>
+      </w:r>
+    </w:p>
+    <w:p>
+      <w:pPr>
+        <w:spacing w:before="0" w:after="40" w:line="240" w:lineRule="auto"/>
+        <w:ind w:left="1411" w:right="1008" w:hanging="259"/>
+      </w:pPr>
+      <w:r>
+        <w:rPr>
+          <w:rFonts w:ascii="Calibri" w:hAnsi="Calibri"/>
+          <w:b w:val="0"/>
+          <w:i w:val="0"/>
+          <w:color w:val="2F5C99"/>
+          <w:sz w:val="22"/>
+        </w:rPr>
+        <w:t xml:space="preserve">•  </w:t>
+      </w:r>
+      <w:r>
+        <w:rPr>
+          <w:rFonts w:ascii="Calibri" w:hAnsi="Calibri"/>
+          <w:b w:val="0"/>
+          <w:i w:val="0"/>
+          <w:color w:val="2F5C99"/>
+          <w:sz w:val="22"/>
+        </w:rPr>
+        <w:t>Amélioration de la satisfaction des équipes mesurée par enquête interne.</w:t>
+      </w:r>
+    </w:p>
+    <w:p>
+      <w:r>
+        <w:br w:type="page"/>
+      </w:r>
+    </w:p>
+    <w:tbl>
+      <w:tblPr>
+        <w:tblW w:type="auto" w:w="0"/>
+        <w:tblLook w:firstColumn="1" w:firstRow="1" w:lastColumn="0" w:lastRow="0" w:noHBand="0" w:noVBand="1" w:val="04A0"/>
+        <w:tblBorders>
+          <w:top w:val="none" w:sz="0" w:space="0"/>
+          <w:left w:val="none" w:sz="0" w:space="0"/>
+          <w:bottom w:val="none" w:sz="0" w:space="0"/>
+          <w:right w:val="none" w:sz="0" w:space="0"/>
+          <w:insideH w:val="none" w:sz="0" w:space="0"/>
+          <w:insideV w:val="none" w:sz="0" w:space="0"/>
+        </w:tblBorders>
+      </w:tblPr>
+      <w:tblGrid>
+        <w:gridCol w:w="9029"/>
+      </w:tblGrid>
+      <w:tr>
+        <w:tc>
+          <w:tcPr>
+            <w:tcW w:type="dxa" w:w="11908"/>
+            <w:shd w:val="clear" w:color="auto" w:fill="143255"/>
+            <w:tcMar>
+              <w:top w:w="170" w:type="dxa"/>
+              <w:start w:w="1007" w:type="dxa"/>
+              <w:bottom w:w="170" w:type="dxa"/>
+              <w:end w:w="500" w:type="dxa"/>
+            </w:tcMar>
+          </w:tcPr>
+          <w:p>
+            <w:pPr>
+              <w:spacing w:before="0" w:after="0"/>
+            </w:pPr>
+            <w:r>
+              <w:rPr>
+                <w:rFonts w:ascii="Montserrat" w:hAnsi="Montserrat"/>
+                <w:b/>
+                <w:i w:val="0"/>
+                <w:color w:val="FFFFFF"/>
+                <w:sz w:val="36"/>
+              </w:rPr>
+              <w:t>SACHA DUBOIS</w:t>
+            </w:r>
+          </w:p>
+          <w:p>
+            <w:pPr>
+              <w:spacing w:before="0" w:after="0"/>
+            </w:pPr>
+            <w:r>
+              <w:rPr>
+                <w:rFonts w:ascii="Montserrat" w:hAnsi="Montserrat"/>
+                <w:b w:val="0"/>
+                <w:i w:val="0"/>
+                <w:color w:val="FFFFFF"/>
+                <w:sz w:val="21"/>
+                <w:caps w:val="true"/>
+              </w:rPr>
+              <w:t>CHARGÉE DE PROJET</w:t>
+            </w:r>
+          </w:p>
+        </w:tc>
+      </w:tr>
+    </w:tbl>
+    <w:p>
+      <w:pPr>
+        <w:spacing w:before="0" w:after="120"/>
+      </w:pPr>
+    </w:p>
+    <w:p>
+      <w:pPr>
+        <w:spacing w:before="240" w:after="160"/>
+        <w:ind w:left="1008" w:right="1008"/>
+      </w:pPr>
+      <w:r>
+        <w:rPr>
+          <w:rFonts w:ascii="Montserrat" w:hAnsi="Montserrat"/>
+          <w:b/>
+          <w:i w:val="0"/>
+          <w:color w:val="143255"/>
+          <w:sz w:val="32"/>
+          <w:caps w:val="true"/>
+        </w:rPr>
+        <w:t>Certifications</w:t>
+      </w:r>
+    </w:p>
+    <w:p>
+      <w:pPr>
+        <w:spacing w:before="0" w:after="40" w:line="240" w:lineRule="auto"/>
+        <w:ind w:left="1411" w:right="1008" w:hanging="259"/>
+      </w:pPr>
+      <w:r>
+        <w:rPr>
+          <w:rFonts w:ascii="Calibri" w:hAnsi="Calibri"/>
+          <w:b w:val="0"/>
+          <w:i w:val="0"/>
+          <w:color w:val="2F5C99"/>
+          <w:sz w:val="22"/>
+        </w:rPr>
+        <w:t xml:space="preserve">•  </w:t>
+      </w:r>
+      <w:r>
+        <w:rPr>
+          <w:rFonts w:ascii="Calibri" w:hAnsi="Calibri"/>
+          <w:b w:val="0"/>
+          <w:i w:val="0"/>
+          <w:color w:val="2F5C99"/>
+          <w:sz w:val="22"/>
+        </w:rPr>
+        <w:t>PMP – Project Management Professional (PMI)</w:t>
+      </w:r>
+    </w:p>
+    <w:p>
+      <w:pPr>
+        <w:spacing w:before="0" w:after="40" w:line="240" w:lineRule="auto"/>
+        <w:ind w:left="1411" w:right="1008" w:hanging="259"/>
+      </w:pPr>
+      <w:r>
+        <w:rPr>
+          <w:rFonts w:ascii="Calibri" w:hAnsi="Calibri"/>
+          <w:b w:val="0"/>
+          <w:i w:val="0"/>
+          <w:color w:val="2F5C99"/>
+          <w:sz w:val="22"/>
+        </w:rPr>
+        <w:t xml:space="preserve">•  </w:t>
+      </w:r>
+      <w:r>
+        <w:rPr>
+          <w:rFonts w:ascii="Calibri" w:hAnsi="Calibri"/>
+          <w:b w:val="0"/>
+          <w:i w:val="0"/>
+          <w:color w:val="2F5C99"/>
+          <w:sz w:val="22"/>
+        </w:rPr>
+        <w:t>PRINCE2 Foundation &amp; Practitioner</w:t>
+      </w:r>
+    </w:p>
+    <w:p>
+      <w:pPr>
+        <w:spacing w:before="0" w:after="40" w:line="240" w:lineRule="auto"/>
+        <w:ind w:left="1411" w:right="1008" w:hanging="259"/>
+      </w:pPr>
+      <w:r>
+        <w:rPr>
+          <w:rFonts w:ascii="Calibri" w:hAnsi="Calibri"/>
+          <w:b w:val="0"/>
+          <w:i w:val="0"/>
+          <w:color w:val="2F5C99"/>
+          <w:sz w:val="22"/>
+        </w:rPr>
+        <w:t xml:space="preserve">•  </w:t>
+      </w:r>
+      <w:r>
+        <w:rPr>
+          <w:rFonts w:ascii="Calibri" w:hAnsi="Calibri"/>
+          <w:b w:val="0"/>
+          <w:i w:val="0"/>
+          <w:color w:val="2F5C99"/>
+          <w:sz w:val="22"/>
+        </w:rPr>
+        <w:t>Professional Scrum Master I (PSM I)</w:t>
+      </w:r>
+    </w:p>
+    <w:p>
+      <w:pPr>
+        <w:spacing w:before="240" w:after="160"/>
+        <w:ind w:left="1008" w:right="1008"/>
+      </w:pPr>
+      <w:r>
+        <w:rPr>
+          <w:rFonts w:ascii="Montserrat" w:hAnsi="Montserrat"/>
+          <w:b/>
+          <w:i w:val="0"/>
+          <w:color w:val="143255"/>
+          <w:sz w:val="32"/>
+          <w:caps w:val="true"/>
+        </w:rPr>
+        <w:t>Formations Complémentaires</w:t>
+      </w:r>
+    </w:p>
+    <w:p>
+      <w:pPr>
+        <w:tabs>
+          <w:tab w:pos="10800" w:val="right"/>
+        </w:tabs>
+        <w:spacing w:before="160" w:after="0" w:line="240" w:lineRule="auto"/>
+        <w:ind w:left="1008" w:right="1008"/>
+      </w:pPr>
+      <w:r>
+        <w:rPr>
+          <w:rFonts w:ascii="Montserrat" w:hAnsi="Montserrat"/>
+          <w:b/>
+          <w:i w:val="0"/>
+          <w:color w:val="143255"/>
+          <w:sz w:val="25"/>
+        </w:rPr>
+        <w:t>Certificat en Gestion Financière de Projet</w:t>
+      </w:r>
+      <w:r>
+        <w:rPr>
+          <w:rFonts w:ascii="Calibri" w:hAnsi="Calibri"/>
+          <w:b w:val="0"/>
+          <w:i/>
+          <w:color w:val="2F5C99"/>
+          <w:sz w:val="20"/>
+        </w:rPr>
+        <w:tab/>
+        <w:t>2019</w:t>
+      </w:r>
+    </w:p>
+    <w:p>
+      <w:pPr>
+        <w:spacing w:before="0" w:after="40" w:line="240" w:lineRule="auto"/>
+        <w:ind w:left="1008"/>
+      </w:pPr>
+      <w:r>
+        <w:rPr>
+          <w:rFonts w:ascii="Calibri" w:hAnsi="Calibri"/>
+          <w:b w:val="0"/>
+          <w:i/>
+          <w:color w:val="2F5C99"/>
+          <w:sz w:val="23"/>
+        </w:rPr>
+        <w:t>Really Great School - Any City</w:t>
+      </w:r>
+    </w:p>
+    <w:p>
+      <w:pPr>
+        <w:spacing w:before="0" w:after="40" w:line="240" w:lineRule="auto"/>
+        <w:ind w:left="1411" w:right="1008" w:hanging="259"/>
+      </w:pPr>
+      <w:r>
+        <w:rPr>
+          <w:rFonts w:ascii="Calibri" w:hAnsi="Calibri"/>
+          <w:b w:val="0"/>
+          <w:i w:val="0"/>
+          <w:color w:val="2F5C99"/>
+          <w:sz w:val="22"/>
+        </w:rPr>
+        <w:t xml:space="preserve">•  </w:t>
+      </w:r>
+      <w:r>
+        <w:rPr>
+          <w:rFonts w:ascii="Calibri" w:hAnsi="Calibri"/>
+          <w:b w:val="0"/>
+          <w:i w:val="0"/>
+          <w:color w:val="2F5C99"/>
+          <w:sz w:val="22"/>
+        </w:rPr>
+        <w:t>Construction et suivi de budgets, analyse des écarts et reporting.</w:t>
+      </w:r>
+    </w:p>
+    <w:p>
+      <w:pPr>
+        <w:tabs>
+          <w:tab w:pos="10800" w:val="right"/>
+        </w:tabs>
+        <w:spacing w:before="160" w:after="0" w:line="240" w:lineRule="auto"/>
+        <w:ind w:left="1008" w:right="1008"/>
+      </w:pPr>
+      <w:r>
+        <w:rPr>
+          <w:rFonts w:ascii="Montserrat" w:hAnsi="Montserrat"/>
+          <w:b/>
+          <w:i w:val="0"/>
+          <w:color w:val="143255"/>
+          <w:sz w:val="25"/>
+        </w:rPr>
+        <w:t>Atelier Leadership et Management d'Équipe</w:t>
+      </w:r>
+      <w:r>
+        <w:rPr>
+          <w:rFonts w:ascii="Calibri" w:hAnsi="Calibri"/>
+          <w:b w:val="0"/>
+          <w:i/>
+          <w:color w:val="2F5C99"/>
+          <w:sz w:val="20"/>
+        </w:rPr>
+        <w:tab/>
+        <w:t>2018</w:t>
+      </w:r>
+    </w:p>
+    <w:p>
+      <w:pPr>
+        <w:spacing w:before="0" w:after="40" w:line="240" w:lineRule="auto"/>
+        <w:ind w:left="1008"/>
+      </w:pPr>
+      <w:r>
+        <w:rPr>
+          <w:rFonts w:ascii="Calibri" w:hAnsi="Calibri"/>
+          <w:b w:val="0"/>
+          <w:i/>
+          <w:color w:val="2F5C99"/>
+          <w:sz w:val="23"/>
+        </w:rPr>
+        <w:t>Really Great Institute - Any City</w:t>
+      </w:r>
+    </w:p>
+    <w:p>
+      <w:pPr>
+        <w:spacing w:before="0" w:after="40" w:line="240" w:lineRule="auto"/>
+        <w:ind w:left="1411" w:right="1008" w:hanging="259"/>
+      </w:pPr>
+      <w:r>
+        <w:rPr>
+          <w:rFonts w:ascii="Calibri" w:hAnsi="Calibri"/>
+          <w:b w:val="0"/>
+          <w:i w:val="0"/>
+          <w:color w:val="2F5C99"/>
+          <w:sz w:val="22"/>
+        </w:rPr>
+        <w:t xml:space="preserve">•  </w:t>
+      </w:r>
+      <w:r>
+        <w:rPr>
+          <w:rFonts w:ascii="Calibri" w:hAnsi="Calibri"/>
+          <w:b w:val="0"/>
+          <w:i w:val="0"/>
+          <w:color w:val="2F5C99"/>
+          <w:sz w:val="22"/>
+        </w:rPr>
+        <w:t>Techniques d'animation, communication et résolution de conflits.</w:t>
+      </w:r>
+    </w:p>
+    <w:p>
+      <w:pPr>
+        <w:spacing w:before="240" w:after="160"/>
+        <w:ind w:left="1008" w:right="1008"/>
+      </w:pPr>
+      <w:r>
+        <w:rPr>
+          <w:rFonts w:ascii="Montserrat" w:hAnsi="Montserrat"/>
+          <w:b/>
+          <w:i w:val="0"/>
+          <w:color w:val="143255"/>
+          <w:sz w:val="32"/>
+          <w:caps w:val="true"/>
+        </w:rPr>
+        <w:t>Réalisations Clés</w:t>
+      </w:r>
+    </w:p>
+    <w:p>
+      <w:pPr>
+        <w:spacing w:before="0" w:after="40" w:line="240" w:lineRule="auto"/>
+        <w:ind w:left="1411" w:right="1008" w:hanging="259"/>
+      </w:pPr>
+      <w:r>
+        <w:rPr>
+          <w:rFonts w:ascii="Calibri" w:hAnsi="Calibri"/>
+          <w:b w:val="0"/>
+          <w:i w:val="0"/>
+          <w:color w:val="2F5C99"/>
+          <w:sz w:val="22"/>
+        </w:rPr>
+        <w:t xml:space="preserve">•  </w:t>
+      </w:r>
+      <w:r>
+        <w:rPr>
+          <w:rFonts w:ascii="Calibri" w:hAnsi="Calibri"/>
+          <w:b w:val="0"/>
+          <w:i w:val="0"/>
+          <w:color w:val="2F5C99"/>
+          <w:sz w:val="22"/>
+        </w:rPr>
+        <w:t>Livraison de plus de 20 projets dans les délais et le budget impartis.</w:t>
+      </w:r>
+    </w:p>
+    <w:p>
+      <w:pPr>
+        <w:spacing w:before="0" w:after="40" w:line="240" w:lineRule="auto"/>
+        <w:ind w:left="1411" w:right="1008" w:hanging="259"/>
+      </w:pPr>
+      <w:r>
+        <w:rPr>
+          <w:rFonts w:ascii="Calibri" w:hAnsi="Calibri"/>
+          <w:b w:val="0"/>
+          <w:i w:val="0"/>
+          <w:color w:val="2F5C99"/>
+          <w:sz w:val="22"/>
+        </w:rPr>
+        <w:t xml:space="preserve">•  </w:t>
+      </w:r>
+      <w:r>
+        <w:rPr>
+          <w:rFonts w:ascii="Calibri" w:hAnsi="Calibri"/>
+          <w:b w:val="0"/>
+          <w:i w:val="0"/>
+          <w:color w:val="2F5C99"/>
+          <w:sz w:val="22"/>
+        </w:rPr>
+        <w:t>Gestion d'un portefeuille de projets représentant un budget annuel conséquent.</w:t>
+      </w:r>
+    </w:p>
+    <w:p>
+      <w:pPr>
+        <w:spacing w:before="0" w:after="40" w:line="240" w:lineRule="auto"/>
+        <w:ind w:left="1411" w:right="1008" w:hanging="259"/>
+      </w:pPr>
+      <w:r>
+        <w:rPr>
+          <w:rFonts w:ascii="Calibri" w:hAnsi="Calibri"/>
+          <w:b w:val="0"/>
+          <w:i w:val="0"/>
+          <w:color w:val="2F5C99"/>
+          <w:sz w:val="22"/>
+        </w:rPr>
+        <w:t xml:space="preserve">•  </w:t>
+      </w:r>
+      <w:r>
+        <w:rPr>
+          <w:rFonts w:ascii="Calibri" w:hAnsi="Calibri"/>
+          <w:b w:val="0"/>
+          <w:i w:val="0"/>
+          <w:color w:val="2F5C99"/>
+          <w:sz w:val="22"/>
+        </w:rPr>
+        <w:t>Mise en place d'une méthodologie de suivi adoptée par l'ensemble des équipes.</w:t>
+      </w:r>
+    </w:p>
+    <w:p>
+      <w:pPr>
+        <w:spacing w:before="240" w:after="160"/>
+        <w:ind w:left="1008" w:right="1008"/>
+      </w:pPr>
+      <w:r>
+        <w:rPr>
+          <w:rFonts w:ascii="Montserrat" w:hAnsi="Montserrat"/>
+          <w:b/>
+          <w:i w:val="0"/>
+          <w:color w:val="143255"/>
+          <w:sz w:val="32"/>
+          <w:caps w:val="true"/>
+        </w:rPr>
+        <w:t>Références</w:t>
+      </w:r>
+    </w:p>
+    <w:p>
+      <w:pPr>
+        <w:spacing w:before="0" w:after="60" w:line="264" w:lineRule="auto"/>
+        <w:ind w:left="1008" w:right="1008"/>
+      </w:pPr>
+      <w:r>
+        <w:rPr>
+          <w:rFonts w:ascii="Calibri" w:hAnsi="Calibri"/>
+          <w:b/>
+          <w:i w:val="0"/>
+          <w:color w:val="143255"/>
+          <w:sz w:val="22"/>
+        </w:rPr>
+        <w:t xml:space="preserve">Jordan Smith : </w:t>
+      </w:r>
+      <w:r>
+        <w:rPr>
+          <w:rFonts w:ascii="Calibri" w:hAnsi="Calibri"/>
+          <w:b w:val="0"/>
+          <w:i w:val="0"/>
+          <w:color w:val="2F5C99"/>
+          <w:sz w:val="22"/>
+        </w:rPr>
+        <w:t>Directeur de Projet, Really Great Company</w:t>
+      </w:r>
+    </w:p>
+    <w:p>
+      <w:pPr>
+        <w:spacing w:before="0" w:after="60" w:line="264" w:lineRule="auto"/>
+        <w:ind w:left="1008" w:right="1008"/>
+      </w:pPr>
+      <w:r>
+        <w:rPr>
+          <w:rFonts w:ascii="Calibri" w:hAnsi="Calibri"/>
+          <w:b/>
+          <w:i w:val="0"/>
+          <w:color w:val="143255"/>
+          <w:sz w:val="22"/>
+        </w:rPr>
+        <w:t xml:space="preserve">Contact : </w:t>
+      </w:r>
+      <w:r>
+        <w:rPr>
+          <w:rFonts w:ascii="Calibri" w:hAnsi="Calibri"/>
+          <w:b w:val="0"/>
+          <w:i w:val="0"/>
+          <w:color w:val="2F5C99"/>
+          <w:sz w:val="22"/>
+        </w:rPr>
+        <w:t>123-456-7890 · hello@reallygreatsite.com</w:t>
+      </w:r>
+    </w:p>
+    <w:p>
+      <w:pPr>
+        <w:spacing w:before="0" w:after="120" w:line="276" w:lineRule="auto"/>
+        <w:ind w:left="1008" w:right="1008"/>
+      </w:pPr>
+      <w:r>
+        <w:rPr>
+          <w:rFonts w:ascii="Calibri" w:hAnsi="Calibri"/>
+          <w:b w:val="0"/>
+          <w:i w:val="0"/>
+          <w:color w:val="143255"/>
+          <w:sz w:val="22"/>
+        </w:rPr>
+        <w:t xml:space="preserve"> </w:t>
+      </w:r>
+    </w:p>
+    <w:p>
+      <w:pPr>
+        <w:spacing w:before="0" w:after="60" w:line="264" w:lineRule="auto"/>
+        <w:ind w:left="1008" w:right="1008"/>
+      </w:pPr>
+      <w:r>
+        <w:rPr>
+          <w:rFonts w:ascii="Calibri" w:hAnsi="Calibri"/>
+          <w:b/>
+          <w:i w:val="0"/>
+          <w:color w:val="143255"/>
+          <w:sz w:val="22"/>
+        </w:rPr>
+        <w:t xml:space="preserve">Alex Martin : </w:t>
+      </w:r>
+      <w:r>
+        <w:rPr>
+          <w:rFonts w:ascii="Calibri" w:hAnsi="Calibri"/>
+          <w:b w:val="0"/>
+          <w:i w:val="0"/>
+          <w:color w:val="2F5C99"/>
+          <w:sz w:val="22"/>
+        </w:rPr>
+        <w:t>Responsable des Opérations, Really Great Company</w:t>
+      </w:r>
+    </w:p>
+    <w:p>
+      <w:pPr>
+        <w:spacing w:before="0" w:after="60" w:line="264" w:lineRule="auto"/>
+        <w:ind w:left="1008" w:right="1008"/>
+      </w:pPr>
+      <w:r>
+        <w:rPr>
+          <w:rFonts w:ascii="Calibri" w:hAnsi="Calibri"/>
+          <w:b/>
+          <w:i w:val="0"/>
+          <w:color w:val="143255"/>
+          <w:sz w:val="22"/>
+        </w:rPr>
+        <w:t xml:space="preserve">Contact : </w:t>
+      </w:r>
+      <w:r>
+        <w:rPr>
+          <w:rFonts w:ascii="Calibri" w:hAnsi="Calibri"/>
+          <w:b w:val="0"/>
+          <w:i w:val="0"/>
+          <w:color w:val="2F5C99"/>
+          <w:sz w:val="22"/>
+        </w:rPr>
+        <w:t>123-456-7891 · contact@reallygreatsite.com</w:t>
+      </w:r>
+    </w:p>
     <w:sectPr>
       <w:pgSz w:w="11909" w:h="16834"/>
       <w:pgMar w:top="0" w:right="0" w:bottom="0" w:left="0" w:header="720" w:footer="720" w:gutter="0"/>

</xml_diff>